<commit_message>
added value summary in reports page
</commit_message>
<xml_diff>
--- a/reports_output/pms_log_1_2026.docx
+++ b/reports_output/pms_log_1_2026.docx
@@ -28,7 +28,7 @@
         </w:rPr>
       </w:pPr>
       <w:r>
-        <w:t>Generated by: Admin</w:t>
+        <w:t>Generated by: Secretary</w:t>
       </w:r>
     </w:p>
     <w:p>
@@ -41,7 +41,7 @@
         </w:rPr>
       </w:pPr>
       <w:r>
-        <w:t>Date &amp; Time Generated: 2026-01-09 20:36:13</w:t>
+        <w:t>Date &amp; Time Generated: 2026-01-21 10:12:23</w:t>
       </w:r>
     </w:p>
     <w:p>
@@ -329,7 +329,7 @@
           </w:tcPr>
           <w:p>
             <w:r>
-              <w:t>2025-05-23</w:t>
+              <w:t>2026-01-01</w:t>
             </w:r>
           </w:p>
         </w:tc>
@@ -349,7 +349,7 @@
           </w:tcPr>
           <w:p>
             <w:r>
-              <w:t>5.00</w:t>
+              <w:t>12.00</w:t>
             </w:r>
           </w:p>
         </w:tc>
@@ -359,7 +359,7 @@
           </w:tcPr>
           <w:p>
             <w:r>
-              <w:t>2025-10-09</w:t>
+              <w:t>2026-01-30</w:t>
             </w:r>
           </w:p>
         </w:tc>
@@ -412,58 +412,6 @@
           <w:p>
             <w:r>
               <w:t>2025-09-09</w:t>
-            </w:r>
-          </w:p>
-        </w:tc>
-      </w:tr>
-      <w:tr>
-        <w:tc>
-          <w:tcPr>
-            <w:tcW w:type="dxa" w:w="2117"/>
-          </w:tcPr>
-          <w:p>
-            <w:r>
-              <w:t>Hyundai Starex</w:t>
-            </w:r>
-          </w:p>
-        </w:tc>
-        <w:tc>
-          <w:tcPr>
-            <w:tcW w:type="dxa" w:w="1627"/>
-          </w:tcPr>
-          <w:p>
-            <w:r>
-              <w:t>2025-01-18</w:t>
-            </w:r>
-          </w:p>
-        </w:tc>
-        <w:tc>
-          <w:tcPr>
-            <w:tcW w:type="dxa" w:w="2342"/>
-          </w:tcPr>
-          <w:p>
-            <w:r>
-              <w:t>320</w:t>
-            </w:r>
-          </w:p>
-        </w:tc>
-        <w:tc>
-          <w:tcPr>
-            <w:tcW w:type="dxa" w:w="1402"/>
-          </w:tcPr>
-          <w:p>
-            <w:r>
-              <w:t>7.00</w:t>
-            </w:r>
-          </w:p>
-        </w:tc>
-        <w:tc>
-          <w:tcPr>
-            <w:tcW w:type="dxa" w:w="1872"/>
-          </w:tcPr>
-          <w:p>
-            <w:r>
-              <w:t>2025-10-09</w:t>
             </w:r>
           </w:p>
         </w:tc>

</xml_diff>